<commit_message>
Laboratoire 11: correction dossier images
</commit_message>
<xml_diff>
--- a/lab11/rapport.docx
+++ b/lab11/rapport.docx
@@ -2,6 +2,372 @@
 <file path=word/document.xml><?xml version="1.0" encoding="utf-8"?>
 <w:document xmlns:w="http://schemas.openxmlformats.org/wordprocessingml/2006/main" xmlns:m="http://schemas.openxmlformats.org/officeDocument/2006/math" xmlns:r="http://schemas.openxmlformats.org/officeDocument/2006/relationships" xmlns:o="urn:schemas-microsoft-com:office:office" xmlns:v="urn:schemas-microsoft-com:vml" xmlns:w10="urn:schemas-microsoft-com:office:word" xmlns:a="http://schemas.openxmlformats.org/drawingml/2006/main" xmlns:pic="http://schemas.openxmlformats.org/drawingml/2006/picture" xmlns:wp="http://schemas.openxmlformats.org/drawingml/2006/wordprocessingDrawing">
   <w:body>
+    <w:p>
+      <w:pPr>
+        <w:pStyle w:val="Title"/>
+      </w:pPr>
+      <w:r>
+        <w:t xml:space="preserve">Лабораторная</w:t>
+      </w:r>
+      <w:r>
+        <w:t xml:space="preserve"> </w:t>
+      </w:r>
+      <w:r>
+        <w:t xml:space="preserve">работа</w:t>
+      </w:r>
+      <w:r>
+        <w:t xml:space="preserve"> </w:t>
+      </w:r>
+      <w:r>
+        <w:t xml:space="preserve">№11:</w:t>
+      </w:r>
+      <w:r>
+        <w:t xml:space="preserve"> </w:t>
+      </w:r>
+      <w:r>
+        <w:t xml:space="preserve">Текстовой</w:t>
+      </w:r>
+      <w:r>
+        <w:t xml:space="preserve"> </w:t>
+      </w:r>
+      <w:r>
+        <w:t xml:space="preserve">редактор</w:t>
+      </w:r>
+      <w:r>
+        <w:t xml:space="preserve"> </w:t>
+      </w:r>
+      <w:r>
+        <w:t xml:space="preserve">emacs</w:t>
+      </w:r>
+    </w:p>
+    <w:p>
+      <w:pPr>
+        <w:pStyle w:val="Author"/>
+      </w:pPr>
+      <w:r>
+        <w:t xml:space="preserve">LISSOM</w:t>
+      </w:r>
+      <w:r>
+        <w:t xml:space="preserve"> </w:t>
+      </w:r>
+      <w:r>
+        <w:t xml:space="preserve">BAYEM</w:t>
+      </w:r>
+      <w:r>
+        <w:t xml:space="preserve"> </w:t>
+      </w:r>
+      <w:r>
+        <w:t xml:space="preserve">ODILLON</w:t>
+      </w:r>
+      <w:r>
+        <w:t xml:space="preserve"> </w:t>
+      </w:r>
+      <w:r>
+        <w:t xml:space="preserve">NATHANAEL</w:t>
+      </w:r>
+    </w:p>
+    <w:p>
+      <w:pPr>
+        <w:pStyle w:val="Date"/>
+      </w:pPr>
+    </w:p>
+    <w:bookmarkStart w:id="20" w:name="цель-работы"/>
+    <w:p>
+      <w:pPr>
+        <w:pStyle w:val="Heading1"/>
+      </w:pPr>
+      <w:r>
+        <w:t xml:space="preserve">1. Цель работы</w:t>
+      </w:r>
+    </w:p>
+    <w:p>
+      <w:pPr>
+        <w:pStyle w:val="FirstParagraph"/>
+      </w:pPr>
+      <w:r>
+        <w:t xml:space="preserve">Познакомиться с операционной системой Linux. Получить практические навыки работы с редактором Emacs.</w:t>
+      </w:r>
+    </w:p>
+    <w:bookmarkEnd w:id="20"/>
+    <w:bookmarkStart w:id="21" w:name="задание"/>
+    <w:p>
+      <w:pPr>
+        <w:pStyle w:val="Heading1"/>
+      </w:pPr>
+      <w:r>
+        <w:t xml:space="preserve">2. Задание</w:t>
+      </w:r>
+    </w:p>
+    <w:p>
+      <w:pPr>
+        <w:pStyle w:val="Compact"/>
+        <w:numPr>
+          <w:ilvl w:val="0"/>
+          <w:numId w:val="1001"/>
+        </w:numPr>
+      </w:pPr>
+      <w:r>
+        <w:t xml:space="preserve">Изучить основы работы в Emacs.</w:t>
+      </w:r>
+    </w:p>
+    <w:p>
+      <w:pPr>
+        <w:pStyle w:val="Compact"/>
+        <w:numPr>
+          <w:ilvl w:val="0"/>
+          <w:numId w:val="1001"/>
+        </w:numPr>
+      </w:pPr>
+      <w:r>
+        <w:t xml:space="preserve">Создать файл</w:t>
+      </w:r>
+      <w:r>
+        <w:t xml:space="preserve"> </w:t>
+      </w:r>
+      <w:r>
+        <w:rPr>
+          <w:rStyle w:val="VerbatimChar"/>
+        </w:rPr>
+        <w:t xml:space="preserve">lab07.sh</w:t>
+      </w:r>
+      <w:r>
+        <w:t xml:space="preserve"> </w:t>
+      </w:r>
+      <w:r>
+        <w:t xml:space="preserve">с использованием Emacs.</w:t>
+      </w:r>
+    </w:p>
+    <w:p>
+      <w:pPr>
+        <w:pStyle w:val="Compact"/>
+        <w:numPr>
+          <w:ilvl w:val="0"/>
+          <w:numId w:val="1001"/>
+        </w:numPr>
+      </w:pPr>
+      <w:r>
+        <w:t xml:space="preserve">Выполнить основные команды: открытие, сохранение, закрытие файлов; управление буферами и окнами; поиск и замена.</w:t>
+      </w:r>
+    </w:p>
+    <w:bookmarkEnd w:id="21"/>
+    <w:bookmarkStart w:id="24" w:name="выполнение-лабораторной-работы"/>
+    <w:p>
+      <w:pPr>
+        <w:pStyle w:val="Heading1"/>
+      </w:pPr>
+      <w:r>
+        <w:t xml:space="preserve">3. Выполнение лабораторной работы</w:t>
+      </w:r>
+    </w:p>
+    <w:bookmarkStart w:id="22" w:name="запуск-emacs-и-создание-файла"/>
+    <w:p>
+      <w:pPr>
+        <w:pStyle w:val="Heading2"/>
+      </w:pPr>
+      <w:r>
+        <w:t xml:space="preserve">3.1. Запуск Emacs и создание файла</w:t>
+      </w:r>
+    </w:p>
+    <w:p>
+      <w:pPr>
+        <w:pStyle w:val="FirstParagraph"/>
+      </w:pPr>
+      <w:r>
+        <w:t xml:space="preserve">Запускаем Emacs командой</w:t>
+      </w:r>
+      <w:r>
+        <w:t xml:space="preserve"> </w:t>
+      </w:r>
+      <w:r>
+        <w:rPr>
+          <w:rStyle w:val="VerbatimChar"/>
+        </w:rPr>
+        <w:t xml:space="preserve">emacs &amp;</w:t>
+      </w:r>
+      <w:r>
+        <w:t xml:space="preserve"> </w:t>
+      </w:r>
+      <w:r>
+        <w:t xml:space="preserve">(в фоновом режиме):</w:t>
+      </w:r>
+    </w:p>
+    <w:tbl>
+      <w:tblPr>
+        <w:tblStyle w:val="FigureTable"/>
+        <w:tblW w:type="auto" w:w="0"/>
+        <w:jc w:val="center"/>
+        <w:tblLook w:firstRow="0" w:lastRow="0" w:firstColumn="0" w:lastColumn="0"/>
+      </w:tblPr>
+      <w:tblGrid>
+        <w:gridCol w:w="7920"/>
+      </w:tblGrid>
+      <w:tr>
+        <w:tc>
+          <w:tcPr/>
+          <w:p>
+            <w:pPr>
+              <w:pStyle w:val="Compact"/>
+              <w:jc w:val="center"/>
+            </w:pPr>
+            <w:r>
+              <w:t xml:space="preserve">Запуск Emacs</w:t>
+            </w:r>
+          </w:p>
+        </w:tc>
+      </w:tr>
+    </w:tbl>
+    <w:p>
+      <w:pPr>
+        <w:pStyle w:val="ImageCaption"/>
+      </w:pPr>
+      <w:r>
+        <w:t xml:space="preserve">Запуск Emacs</w:t>
+      </w:r>
+    </w:p>
+    <w:p>
+      <w:pPr>
+        <w:pStyle w:val="BodyText"/>
+      </w:pPr>
+      <w:r>
+        <w:t xml:space="preserve">Создаём новый файл:</w:t>
+      </w:r>
+      <w:r>
+        <w:t xml:space="preserve"> </w:t>
+      </w:r>
+      <w:r>
+        <w:rPr>
+          <w:rStyle w:val="VerbatimChar"/>
+        </w:rPr>
+        <w:t xml:space="preserve">C-x C-f</w:t>
+      </w:r>
+      <w:r>
+        <w:t xml:space="preserve"> </w:t>
+      </w:r>
+      <w:r>
+        <w:t xml:space="preserve">(Ctrl+x, затем Ctrl+f), вводим имя</w:t>
+      </w:r>
+      <w:r>
+        <w:t xml:space="preserve"> </w:t>
+      </w:r>
+      <w:r>
+        <w:rPr>
+          <w:rStyle w:val="VerbatimChar"/>
+        </w:rPr>
+        <w:t xml:space="preserve">lab07.sh</w:t>
+      </w:r>
+      <w:r>
+        <w:t xml:space="preserve">:</w:t>
+      </w:r>
+    </w:p>
+    <w:tbl>
+      <w:tblPr>
+        <w:tblStyle w:val="FigureTable"/>
+        <w:tblW w:type="auto" w:w="0"/>
+        <w:jc w:val="center"/>
+        <w:tblLook w:firstRow="0" w:lastRow="0" w:firstColumn="0" w:lastColumn="0"/>
+      </w:tblPr>
+      <w:tblGrid>
+        <w:gridCol w:w="7920"/>
+      </w:tblGrid>
+      <w:tr>
+        <w:tc>
+          <w:tcPr/>
+          <w:p>
+            <w:pPr>
+              <w:pStyle w:val="Compact"/>
+              <w:jc w:val="center"/>
+            </w:pPr>
+            <w:r>
+              <w:t xml:space="preserve">Открытие файла</w:t>
+            </w:r>
+          </w:p>
+        </w:tc>
+      </w:tr>
+    </w:tbl>
+    <w:p>
+      <w:pPr>
+        <w:pStyle w:val="ImageCaption"/>
+      </w:pPr>
+      <w:r>
+        <w:t xml:space="preserve">Открытие файла</w:t>
+      </w:r>
+    </w:p>
+    <w:bookmarkEnd w:id="22"/>
+    <w:bookmarkStart w:id="23" w:name="ввод-текста"/>
+    <w:p>
+      <w:pPr>
+        <w:pStyle w:val="Heading2"/>
+      </w:pPr>
+      <w:r>
+        <w:t xml:space="preserve">3.2. Ввод текста</w:t>
+      </w:r>
+    </w:p>
+    <w:p>
+      <w:pPr>
+        <w:pStyle w:val="FirstParagraph"/>
+      </w:pPr>
+      <w:r>
+        <w:t xml:space="preserve">В режиме вставки вводим следующий скрипт:</w:t>
+      </w:r>
+    </w:p>
+    <w:p>
+      <w:pPr>
+        <w:pStyle w:val="BodyText"/>
+      </w:pPr>
+      <w:r>
+        <w:t xml:space="preserve">```bash</w:t>
+      </w:r>
+      <w:r>
+        <w:t xml:space="preserve"> </w:t>
+      </w:r>
+      <w:r>
+        <w:t xml:space="preserve">#!/bin/bash</w:t>
+      </w:r>
+      <w:r>
+        <w:t xml:space="preserve"> </w:t>
+      </w:r>
+      <w:r>
+        <w:t xml:space="preserve">HELL=Hello</w:t>
+      </w:r>
+      <w:r>
+        <w:t xml:space="preserve"> </w:t>
+      </w:r>
+      <w:r>
+        <w:t xml:space="preserve">function hello {</w:t>
+      </w:r>
+      <w:r>
+        <w:t xml:space="preserve"> </w:t>
+      </w:r>
+      <w:r>
+        <w:t xml:space="preserve">LOCAL HELLO=World</w:t>
+      </w:r>
+      <w:r>
+        <w:t xml:space="preserve"> </w:t>
+      </w:r>
+      <w:r>
+        <w:t xml:space="preserve">echo $HELLO</w:t>
+      </w:r>
+      <w:r>
+        <w:t xml:space="preserve"> </w:t>
+      </w:r>
+      <w:r>
+        <w:t xml:space="preserve">}</w:t>
+      </w:r>
+      <w:r>
+        <w:t xml:space="preserve"> </w:t>
+      </w:r>
+      <w:r>
+        <w:t xml:space="preserve">echo $HELLO</w:t>
+      </w:r>
+      <w:r>
+        <w:t xml:space="preserve"> </w:t>
+      </w:r>
+      <w:r>
+        <w:t xml:space="preserve">hello</w:t>
+      </w:r>
+    </w:p>
+    <w:bookmarkEnd w:id="23"/>
+    <w:bookmarkEnd w:id="24"/>
     <w:sectPr/>
   </w:body>
 </w:document>
@@ -108,8 +474,123 @@
       </w:pPr>
     </w:lvl>
   </w:abstractNum>
+  <w:abstractNum w:abstractNumId="99411">
+    <w:nsid w:val="00A99411"/>
+    <w:multiLevelType w:val="multilevel"/>
+    <w:lvl w:ilvl="0">
+      <w:start w:val="1"/>
+      <w:numFmt w:val="decimal"/>
+      <w:lvlText w:val="%1."/>
+      <w:lvlJc w:val="left"/>
+      <w:pPr>
+        <w:ind w:left="720" w:hanging="480"/>
+      </w:pPr>
+    </w:lvl>
+    <w:lvl w:ilvl="1">
+      <w:start w:val="1"/>
+      <w:numFmt w:val="decimal"/>
+      <w:lvlText w:val="%2."/>
+      <w:lvlJc w:val="left"/>
+      <w:pPr>
+        <w:ind w:left="1440" w:hanging="480"/>
+      </w:pPr>
+    </w:lvl>
+    <w:lvl w:ilvl="2">
+      <w:start w:val="1"/>
+      <w:numFmt w:val="decimal"/>
+      <w:lvlText w:val="%3."/>
+      <w:lvlJc w:val="left"/>
+      <w:pPr>
+        <w:ind w:left="2160" w:hanging="480"/>
+      </w:pPr>
+    </w:lvl>
+    <w:lvl w:ilvl="3">
+      <w:start w:val="1"/>
+      <w:numFmt w:val="decimal"/>
+      <w:lvlText w:val="%4."/>
+      <w:lvlJc w:val="left"/>
+      <w:pPr>
+        <w:ind w:left="2880" w:hanging="480"/>
+      </w:pPr>
+    </w:lvl>
+    <w:lvl w:ilvl="4">
+      <w:start w:val="1"/>
+      <w:numFmt w:val="decimal"/>
+      <w:lvlText w:val="%5."/>
+      <w:lvlJc w:val="left"/>
+      <w:pPr>
+        <w:ind w:left="3600" w:hanging="480"/>
+      </w:pPr>
+    </w:lvl>
+    <w:lvl w:ilvl="5">
+      <w:start w:val="1"/>
+      <w:numFmt w:val="decimal"/>
+      <w:lvlText w:val="%6."/>
+      <w:lvlJc w:val="left"/>
+      <w:pPr>
+        <w:ind w:left="4320" w:hanging="480"/>
+      </w:pPr>
+    </w:lvl>
+    <w:lvl w:ilvl="6">
+      <w:start w:val="1"/>
+      <w:numFmt w:val="decimal"/>
+      <w:lvlText w:val="%7."/>
+      <w:lvlJc w:val="left"/>
+      <w:pPr>
+        <w:ind w:left="5040" w:hanging="480"/>
+      </w:pPr>
+    </w:lvl>
+    <w:lvl w:ilvl="7">
+      <w:start w:val="1"/>
+      <w:numFmt w:val="decimal"/>
+      <w:lvlText w:val="%8."/>
+      <w:lvlJc w:val="left"/>
+      <w:pPr>
+        <w:ind w:left="5760" w:hanging="480"/>
+      </w:pPr>
+    </w:lvl>
+    <w:lvl w:ilvl="8">
+      <w:start w:val="1"/>
+      <w:numFmt w:val="decimal"/>
+      <w:lvlText w:val="%9."/>
+      <w:lvlJc w:val="left"/>
+      <w:pPr>
+        <w:ind w:left="6480" w:hanging="480"/>
+      </w:pPr>
+    </w:lvl>
+  </w:abstractNum>
   <w:num w:numId="1000">
     <w:abstractNumId w:val="990"/>
+  </w:num>
+  <w:num w:numId="1001">
+    <w:abstractNumId w:val="99411"/>
+    <w:lvlOverride w:ilvl="0">
+      <w:startOverride w:val="1"/>
+    </w:lvlOverride>
+    <w:lvlOverride w:ilvl="1">
+      <w:startOverride w:val="1"/>
+    </w:lvlOverride>
+    <w:lvlOverride w:ilvl="2">
+      <w:startOverride w:val="1"/>
+    </w:lvlOverride>
+    <w:lvlOverride w:ilvl="3">
+      <w:startOverride w:val="1"/>
+    </w:lvlOverride>
+    <w:lvlOverride w:ilvl="4">
+      <w:startOverride w:val="1"/>
+    </w:lvlOverride>
+    <w:lvlOverride w:ilvl="5">
+      <w:startOverride w:val="1"/>
+    </w:lvlOverride>
+    <w:lvlOverride w:ilvl="6">
+      <w:startOverride w:val="1"/>
+    </w:lvlOverride>
+    <w:lvlOverride w:ilvl="7">
+      <w:startOverride w:val="1"/>
+    </w:lvlOverride>
+    <w:lvlOverride w:ilvl="8">
+      <w:startOverride w:val="1"/>
+    </w:lvlOverride>
   </w:num>
 </w:numbering>
 </file>

</xml_diff>